<commit_message>
feat: harden payment, inventory, gateway, and integration flows
</commit_message>
<xml_diff>
--- a/blueprint_kletak-kletik-snack.docx
+++ b/blueprint_kletak-kletik-snack.docx
@@ -1,5 +1,55 @@
 
-<file path=word/document.xml><?xml version="1.0" encoding="utf-8"?>
+<file path=docProps\app.xml><?xml version="1.0" encoding="utf-8"?>
+<Properties xmlns="http://schemas.openxmlformats.org/officeDocument/2006/extended-properties" xmlns:vt="http://schemas.openxmlformats.org/officeDocument/2006/docPropsVTypes">
+  <Template>Normal.dotm</Template>
+  <TotalTime>102</TotalTime>
+  <Pages>19</Pages>
+  <Words>1943</Words>
+  <Characters>11080</Characters>
+  <Application>Microsoft Office Word</Application>
+  <DocSecurity>0</DocSecurity>
+  <Lines>92</Lines>
+  <Paragraphs>25</Paragraphs>
+  <ScaleCrop>false</ScaleCrop>
+  <HeadingPairs>
+    <vt:vector size="2" baseType="variant">
+      <vt:variant>
+        <vt:lpstr>Title</vt:lpstr>
+      </vt:variant>
+      <vt:variant>
+        <vt:i4>1</vt:i4>
+      </vt:variant>
+    </vt:vector>
+  </HeadingPairs>
+  <TitlesOfParts>
+    <vt:vector size="1" baseType="lpstr">
+      <vt:lpstr/>
+    </vt:vector>
+  </TitlesOfParts>
+  <Company/>
+  <LinksUpToDate>false</LinksUpToDate>
+  <CharactersWithSpaces>12998</CharactersWithSpaces>
+  <SharedDoc>false</SharedDoc>
+  <HyperlinksChanged>false</HyperlinksChanged>
+  <AppVersion>16.0000</AppVersion>
+</Properties>
+</file>
+
+<file path=docProps\core.xml><?xml version="1.0" encoding="utf-8"?>
+<cp:coreProperties xmlns:cp="http://schemas.openxmlformats.org/package/2006/metadata/core-properties" xmlns:dc="http://purl.org/dc/elements/1.1/" xmlns:dcterms="http://purl.org/dc/terms/" xmlns:dcmitype="http://purl.org/dc/dcmitype/" xmlns:xsi="http://www.w3.org/2001/XMLSchema-instance">
+  <dc:title/>
+  <dc:subject/>
+  <dc:creator>Fitriani Lestari</dc:creator>
+  <cp:keywords/>
+  <dc:description/>
+  <cp:lastModifiedBy>Fitriani Lestari</cp:lastModifiedBy>
+  <cp:revision>2</cp:revision>
+  <dcterms:created xsi:type="dcterms:W3CDTF">2026-09-17T15:52:00Z</dcterms:created>
+  <dcterms:modified xsi:type="dcterms:W3CDTF">2026-09-17T17:34:00Z</dcterms:modified>
+</cp:coreProperties>
+</file>
+
+<file path=word\document.xml><?xml version="1.0" encoding="utf-8"?>
 <w:document xmlns:wpc="http://schemas.microsoft.com/office/word/2010/wordprocessingCanvas" xmlns:cx="http://schemas.microsoft.com/office/drawing/2014/chartex" xmlns:cx1="http://schemas.microsoft.com/office/drawing/2015/9/8/chartex" xmlns:cx2="http://schemas.microsoft.com/office/drawing/2015/10/21/chartex" xmlns:cx3="http://schemas.microsoft.com/office/drawing/2016/5/9/chartex" xmlns:cx4="http://schemas.microsoft.com/office/drawing/2016/5/10/chartex" xmlns:cx5="http://schemas.microsoft.com/office/drawing/2016/5/11/chartex" xmlns:cx6="http://schemas.microsoft.com/office/drawing/2016/5/12/chartex" xmlns:cx7="http://schemas.microsoft.com/office/drawing/2016/5/13/chartex" xmlns:cx8="http://schemas.microsoft.com/office/drawing/2016/5/14/chartex" xmlns:mc="http://schemas.openxmlformats.org/markup-compatibility/2006" xmlns:aink="http://schemas.microsoft.com/office/drawing/2016/ink" xmlns:am3d="http://schemas.microsoft.com/office/drawing/2017/model3d" xmlns:o="urn:schemas-microsoft-com:office:office" xmlns:oel="http://schemas.microsoft.com/office/2019/extlst" xmlns:r="http://schemas.openxmlformats.org/officeDocument/2006/relationships" xmlns:m="http://schemas.openxmlformats.org/officeDocument/2006/math" xmlns:v="urn:schemas-microsoft-com:vml" xmlns:wp14="http://schemas.microsoft.com/office/word/2010/wordprocessingDrawing" xmlns:wp="http://schemas.openxmlformats.org/drawingml/2006/wordprocessingDrawing" xmlns:w10="urn:schemas-microsoft-com:office:word" xmlns:w="http://schemas.openxmlformats.org/wordprocessingml/2006/main" xmlns:w14="http://schemas.microsoft.com/office/word/2010/wordml" xmlns:w15="http://schemas.microsoft.com/office/word/2012/wordml" xmlns:w16cex="http://schemas.microsoft.com/office/word/2018/wordml/cex" xmlns:w16cid="http://schemas.microsoft.com/office/word/2016/wordml/cid" xmlns:w16="http://schemas.microsoft.com/office/word/2018/wordml" xmlns:w16du="http://schemas.microsoft.com/office/word/2023/wordml/word16du" xmlns:w16sdtdh="http://schemas.microsoft.com/office/word/2020/wordml/sdtdatahash" xmlns:w16sdtfl="http://schemas.microsoft.com/office/word/2024/wordml/sdtformatlock" xmlns:w16se="http://schemas.microsoft.com/office/word/2015/wordml/symex" xmlns:wpg="http://schemas.microsoft.com/office/word/2010/wordprocessingGroup" xmlns:wpi="http://schemas.microsoft.com/office/word/2010/wordprocessingInk" xmlns:wne="http://schemas.microsoft.com/office/word/2006/wordml" xmlns:wps="http://schemas.microsoft.com/office/word/2010/wordprocessingShape" mc:Ignorable="w14 w15 w16se w16cid w16 w16cex w16sdtdh w16sdtfl w16du wp14">
   <w:body>
     <w:p>
@@ -2260,7 +2310,7 @@
         <w:rPr>
           <w:rFonts w:ascii="Arial" w:hAnsi="Arial" w:cs="Arial"/>
         </w:rPr>
-        <w:t>Chat Berbasis WebScket(Socket.IO)</w:t>
+        <w:t>Chat Berbasis WebSocket (Socket.IO)</w:t>
       </w:r>
     </w:p>
     <w:p>
@@ -13180,7 +13230,61 @@
 </w:document>
 </file>
 
-<file path=word/numbering.xml><?xml version="1.0" encoding="utf-8"?>
+<file path=word\fontTable.xml><?xml version="1.0" encoding="utf-8"?>
+<w:fonts xmlns:mc="http://schemas.openxmlformats.org/markup-compatibility/2006" xmlns:r="http://schemas.openxmlformats.org/officeDocument/2006/relationships" xmlns:w="http://schemas.openxmlformats.org/wordprocessingml/2006/main" xmlns:w14="http://schemas.microsoft.com/office/word/2010/wordml" xmlns:w15="http://schemas.microsoft.com/office/word/2012/wordml" xmlns:w16cex="http://schemas.microsoft.com/office/word/2018/wordml/cex" xmlns:w16cid="http://schemas.microsoft.com/office/word/2016/wordml/cid" xmlns:w16="http://schemas.microsoft.com/office/word/2018/wordml" xmlns:w16du="http://schemas.microsoft.com/office/word/2023/wordml/word16du" xmlns:w16sdtdh="http://schemas.microsoft.com/office/word/2020/wordml/sdtdatahash" xmlns:w16sdtfl="http://schemas.microsoft.com/office/word/2024/wordml/sdtformatlock" xmlns:w16se="http://schemas.microsoft.com/office/word/2015/wordml/symex" mc:Ignorable="w14 w15 w16se w16cid w16 w16cex w16sdtdh w16sdtfl w16du">
+  <w:font w:name="Arial">
+    <w:panose1 w:val="020B0604020202020204"/>
+    <w:charset w:val="00"/>
+    <w:family w:val="swiss"/>
+    <w:pitch w:val="variable"/>
+    <w:sig w:usb0="E0002EFF" w:usb1="C000785B" w:usb2="00000009" w:usb3="00000000" w:csb0="000001FF" w:csb1="00000000"/>
+  </w:font>
+  <w:font w:name="Calibri">
+    <w:panose1 w:val="020F0502020204030204"/>
+    <w:charset w:val="00"/>
+    <w:family w:val="swiss"/>
+    <w:pitch w:val="variable"/>
+    <w:sig w:usb0="E4002EFF" w:usb1="C200247B" w:usb2="00000009" w:usb3="00000000" w:csb0="000001FF" w:csb1="00000000"/>
+  </w:font>
+  <w:font w:name="Times New Roman">
+    <w:panose1 w:val="02020603050405020304"/>
+    <w:charset w:val="00"/>
+    <w:family w:val="roman"/>
+    <w:pitch w:val="variable"/>
+    <w:sig w:usb0="E0002EFF" w:usb1="C000785B" w:usb2="00000009" w:usb3="00000000" w:csb0="000001FF" w:csb1="00000000"/>
+  </w:font>
+  <w:font w:name="Courier New">
+    <w:panose1 w:val="02070309020205020404"/>
+    <w:charset w:val="00"/>
+    <w:family w:val="modern"/>
+    <w:pitch w:val="fixed"/>
+    <w:sig w:usb0="E0002EFF" w:usb1="C0007843" w:usb2="00000009" w:usb3="00000000" w:csb0="000001FF" w:csb1="00000000"/>
+  </w:font>
+  <w:font w:name="Wingdings">
+    <w:panose1 w:val="05000000000000000000"/>
+    <w:charset w:val="02"/>
+    <w:family w:val="auto"/>
+    <w:pitch w:val="variable"/>
+    <w:sig w:usb0="00000000" w:usb1="10000000" w:usb2="00000000" w:usb3="00000000" w:csb0="80000000" w:csb1="00000000"/>
+  </w:font>
+  <w:font w:name="Calibri Light">
+    <w:panose1 w:val="020F0302020204030204"/>
+    <w:charset w:val="00"/>
+    <w:family w:val="swiss"/>
+    <w:pitch w:val="variable"/>
+    <w:sig w:usb0="E4002EFF" w:usb1="C200247B" w:usb2="00000009" w:usb3="00000000" w:csb0="000001FF" w:csb1="00000000"/>
+  </w:font>
+  <w:font w:name="Segoe UI">
+    <w:panose1 w:val="020B0502040204020203"/>
+    <w:charset w:val="00"/>
+    <w:family w:val="swiss"/>
+    <w:pitch w:val="variable"/>
+    <w:sig w:usb0="E4002EFF" w:usb1="C000E47F" w:usb2="00000009" w:usb3="00000000" w:csb0="000001FF" w:csb1="00000000"/>
+  </w:font>
+</w:fonts>
+</file>
+
+<file path=word\numbering.xml><?xml version="1.0" encoding="utf-8"?>
 <w:numbering xmlns:wpc="http://schemas.microsoft.com/office/word/2010/wordprocessingCanvas" xmlns:cx="http://schemas.microsoft.com/office/drawing/2014/chartex" xmlns:cx1="http://schemas.microsoft.com/office/drawing/2015/9/8/chartex" xmlns:cx2="http://schemas.microsoft.com/office/drawing/2015/10/21/chartex" xmlns:cx3="http://schemas.microsoft.com/office/drawing/2016/5/9/chartex" xmlns:cx4="http://schemas.microsoft.com/office/drawing/2016/5/10/chartex" xmlns:cx5="http://schemas.microsoft.com/office/drawing/2016/5/11/chartex" xmlns:cx6="http://schemas.microsoft.com/office/drawing/2016/5/12/chartex" xmlns:cx7="http://schemas.microsoft.com/office/drawing/2016/5/13/chartex" xmlns:cx8="http://schemas.microsoft.com/office/drawing/2016/5/14/chartex" xmlns:mc="http://schemas.openxmlformats.org/markup-compatibility/2006" xmlns:aink="http://schemas.microsoft.com/office/drawing/2016/ink" xmlns:am3d="http://schemas.microsoft.com/office/drawing/2017/model3d" xmlns:o="urn:schemas-microsoft-com:office:office" xmlns:oel="http://schemas.microsoft.com/office/2019/extlst" xmlns:r="http://schemas.openxmlformats.org/officeDocument/2006/relationships" xmlns:m="http://schemas.openxmlformats.org/officeDocument/2006/math" xmlns:v="urn:schemas-microsoft-com:vml" xmlns:wp14="http://schemas.microsoft.com/office/word/2010/wordprocessingDrawing" xmlns:wp="http://schemas.openxmlformats.org/drawingml/2006/wordprocessingDrawing" xmlns:w10="urn:schemas-microsoft-com:office:word" xmlns:w="http://schemas.openxmlformats.org/wordprocessingml/2006/main" xmlns:w14="http://schemas.microsoft.com/office/word/2010/wordml" xmlns:w15="http://schemas.microsoft.com/office/word/2012/wordml" xmlns:w16cex="http://schemas.microsoft.com/office/word/2018/wordml/cex" xmlns:w16cid="http://schemas.microsoft.com/office/word/2016/wordml/cid" xmlns:w16="http://schemas.microsoft.com/office/word/2018/wordml" xmlns:w16du="http://schemas.microsoft.com/office/word/2023/wordml/word16du" xmlns:w16sdtdh="http://schemas.microsoft.com/office/word/2020/wordml/sdtdatahash" xmlns:w16sdtfl="http://schemas.microsoft.com/office/word/2024/wordml/sdtformatlock" xmlns:w16se="http://schemas.microsoft.com/office/word/2015/wordml/symex" xmlns:wpg="http://schemas.microsoft.com/office/word/2010/wordprocessingGroup" xmlns:wpi="http://schemas.microsoft.com/office/word/2010/wordprocessingInk" xmlns:wne="http://schemas.microsoft.com/office/word/2006/wordml" xmlns:wps="http://schemas.microsoft.com/office/word/2010/wordprocessingShape" mc:Ignorable="w14 w15 w16se w16cid w16 w16cex w16sdtdh w16sdtfl w16du wp14">
   <w:abstractNum w:abstractNumId="0" w15:restartNumberingAfterBreak="0">
     <w:nsid w:val="03295EB0"/>
@@ -14072,7 +14176,69 @@
 </w:numbering>
 </file>
 
-<file path=word/styles.xml><?xml version="1.0" encoding="utf-8"?>
+<file path=word\settings.xml><?xml version="1.0" encoding="utf-8"?>
+<w:settings xmlns:mc="http://schemas.openxmlformats.org/markup-compatibility/2006" xmlns:o="urn:schemas-microsoft-com:office:office" xmlns:r="http://schemas.openxmlformats.org/officeDocument/2006/relationships" xmlns:m="http://schemas.openxmlformats.org/officeDocument/2006/math" xmlns:v="urn:schemas-microsoft-com:vml" xmlns:w10="urn:schemas-microsoft-com:office:word" xmlns:w="http://schemas.openxmlformats.org/wordprocessingml/2006/main" xmlns:w14="http://schemas.microsoft.com/office/word/2010/wordml" xmlns:w15="http://schemas.microsoft.com/office/word/2012/wordml" xmlns:w16cex="http://schemas.microsoft.com/office/word/2018/wordml/cex" xmlns:w16cid="http://schemas.microsoft.com/office/word/2016/wordml/cid" xmlns:w16="http://schemas.microsoft.com/office/word/2018/wordml" xmlns:w16du="http://schemas.microsoft.com/office/word/2023/wordml/word16du" xmlns:w16sdtdh="http://schemas.microsoft.com/office/word/2020/wordml/sdtdatahash" xmlns:w16sdtfl="http://schemas.microsoft.com/office/word/2024/wordml/sdtformatlock" xmlns:w16se="http://schemas.microsoft.com/office/word/2015/wordml/symex" xmlns:sl="http://schemas.openxmlformats.org/schemaLibrary/2006/main" mc:Ignorable="w14 w15 w16se w16cid w16 w16cex w16sdtdh w16sdtfl w16du">
+  <w:zoom w:percent="100"/>
+  <w:proofState w:spelling="clean" w:grammar="clean"/>
+  <w:defaultTabStop w:val="720"/>
+  <w:characterSpacingControl w:val="doNotCompress"/>
+  <w:compat>
+    <w:compatSetting w:name="compatibilityMode" w:uri="http://schemas.microsoft.com/office/word" w:val="15"/>
+    <w:compatSetting w:name="overrideTableStyleFontSizeAndJustification" w:uri="http://schemas.microsoft.com/office/word" w:val="1"/>
+    <w:compatSetting w:name="enableOpenTypeFeatures" w:uri="http://schemas.microsoft.com/office/word" w:val="1"/>
+    <w:compatSetting w:name="doNotFlipMirrorIndents" w:uri="http://schemas.microsoft.com/office/word" w:val="1"/>
+    <w:compatSetting w:name="differentiateMultirowTableHeaders" w:uri="http://schemas.microsoft.com/office/word" w:val="1"/>
+    <w:compatSetting w:name="useWord2013TrackBottomHyphenation" w:uri="http://schemas.microsoft.com/office/word" w:val="0"/>
+  </w:compat>
+  <w:rsids>
+    <w:rsidRoot w:val="00C54E82"/>
+    <w:rsid w:val="0011246A"/>
+    <w:rsid w:val="0031691B"/>
+    <w:rsid w:val="00332B82"/>
+    <w:rsid w:val="00394481"/>
+    <w:rsid w:val="0047030D"/>
+    <w:rsid w:val="00493270"/>
+    <w:rsid w:val="0056756D"/>
+    <w:rsid w:val="006A3AF5"/>
+    <w:rsid w:val="00744DDF"/>
+    <w:rsid w:val="00B35F99"/>
+    <w:rsid w:val="00C54E82"/>
+    <w:rsid w:val="00CC2841"/>
+    <w:rsid w:val="00DD1D0A"/>
+    <w:rsid w:val="00E971D3"/>
+    <w:rsid w:val="00EA09DF"/>
+    <w:rsid w:val="00EE0038"/>
+  </w:rsids>
+  <m:mathPr>
+    <m:mathFont m:val="Cambria Math"/>
+    <m:brkBin m:val="before"/>
+    <m:brkBinSub m:val="--"/>
+    <m:smallFrac m:val="0"/>
+    <m:dispDef/>
+    <m:lMargin m:val="0"/>
+    <m:rMargin m:val="0"/>
+    <m:defJc m:val="centerGroup"/>
+    <m:wrapIndent m:val="1440"/>
+    <m:intLim m:val="subSup"/>
+    <m:naryLim m:val="undOvr"/>
+  </m:mathPr>
+  <w:themeFontLang w:val="en-ID" w:bidi="ar-SA"/>
+  <w:clrSchemeMapping w:bg1="light1" w:t1="dark1" w:bg2="light2" w:t2="dark2" w:accent1="accent1" w:accent2="accent2" w:accent3="accent3" w:accent4="accent4" w:accent5="accent5" w:accent6="accent6" w:hyperlink="hyperlink" w:followedHyperlink="followedHyperlink"/>
+  <w:shapeDefaults>
+    <o:shapedefaults v:ext="edit" spidmax="1026"/>
+    <o:shapelayout v:ext="edit">
+      <o:idmap v:ext="edit" data="1"/>
+    </o:shapelayout>
+  </w:shapeDefaults>
+  <w:decimalSymbol w:val=","/>
+  <w:listSeparator w:val=";"/>
+  <w14:docId w14:val="2296D43B"/>
+  <w15:chartTrackingRefBased/>
+  <w15:docId w15:val="{FF63BF9D-BCFC-4561-BFC2-57E0E2B71EC2}"/>
+</w:settings>
+</file>
+
+<file path=word\styles.xml><?xml version="1.0" encoding="utf-8"?>
 <w:styles xmlns:mc="http://schemas.openxmlformats.org/markup-compatibility/2006" xmlns:r="http://schemas.openxmlformats.org/officeDocument/2006/relationships" xmlns:w="http://schemas.openxmlformats.org/wordprocessingml/2006/main" xmlns:w14="http://schemas.microsoft.com/office/word/2010/wordml" xmlns:w15="http://schemas.microsoft.com/office/word/2012/wordml" xmlns:w16cex="http://schemas.microsoft.com/office/word/2018/wordml/cex" xmlns:w16cid="http://schemas.microsoft.com/office/word/2016/wordml/cid" xmlns:w16="http://schemas.microsoft.com/office/word/2018/wordml" xmlns:w16du="http://schemas.microsoft.com/office/word/2023/wordml/word16du" xmlns:w16sdtdh="http://schemas.microsoft.com/office/word/2020/wordml/sdtdatahash" xmlns:w16sdtfl="http://schemas.microsoft.com/office/word/2024/wordml/sdtformatlock" xmlns:w16se="http://schemas.microsoft.com/office/word/2015/wordml/symex" mc:Ignorable="w14 w15 w16se w16cid w16 w16cex w16sdtdh w16sdtfl w16du">
   <w:docDefaults>
     <w:rPrDefault>
@@ -15045,7 +15211,7 @@
 </w:styles>
 </file>
 
-<file path=word/theme/theme1.xml><?xml version="1.0" encoding="utf-8"?>
+<file path=word\theme\theme1.xml><?xml version="1.0" encoding="utf-8"?>
 <a:theme xmlns:a="http://schemas.openxmlformats.org/drawingml/2006/main" name="Office Theme">
   <a:themeElements>
     <a:clrScheme name="Office">
@@ -15338,4 +15504,11 @@
     </a:ext>
   </a:extLst>
 </a:theme>
+</file>
+
+<file path=word\webSettings.xml><?xml version="1.0" encoding="utf-8"?>
+<w:webSettings xmlns:mc="http://schemas.openxmlformats.org/markup-compatibility/2006" xmlns:r="http://schemas.openxmlformats.org/officeDocument/2006/relationships" xmlns:w="http://schemas.openxmlformats.org/wordprocessingml/2006/main" xmlns:w14="http://schemas.microsoft.com/office/word/2010/wordml" xmlns:w15="http://schemas.microsoft.com/office/word/2012/wordml" xmlns:w16cex="http://schemas.microsoft.com/office/word/2018/wordml/cex" xmlns:w16cid="http://schemas.microsoft.com/office/word/2016/wordml/cid" xmlns:w16="http://schemas.microsoft.com/office/word/2018/wordml" xmlns:w16du="http://schemas.microsoft.com/office/word/2023/wordml/word16du" xmlns:w16sdtdh="http://schemas.microsoft.com/office/word/2020/wordml/sdtdatahash" xmlns:w16sdtfl="http://schemas.microsoft.com/office/word/2024/wordml/sdtformatlock" xmlns:w16se="http://schemas.microsoft.com/office/word/2015/wordml/symex" mc:Ignorable="w14 w15 w16se w16cid w16 w16cex w16sdtdh w16sdtfl w16du">
+  <w:optimizeForBrowser/>
+  <w:allowPNG/>
+</w:webSettings>
 </file>
</xml_diff>